<commit_message>
feat: add Appendix C sensitivity analysis and Figure S1 to supplementary materials
</commit_message>
<xml_diff>
--- a/Supplementary_Materials.docx
+++ b/Supplementary_Materials.docx
@@ -1215,6 +1215,76 @@
         <w:t>All models, walk-forward validation routines, inventory simulations, and statistical tracking signals were implemented in Python 3.10+ using scikit-learn 1.4+, LightGBM 4.3+, XGBoost 2.0+, NumPy 1.26+, and pandas 2.2+. Full automated verification executes across 11 modular test suites (90 unit and regression tests) in 21.76 seconds, confirming complete absence of data leakage, parameter stability, and mathematical correctness.</w:t>
       </w:r>
     </w:p>
+    <w:p>
+      <w:r>
+        <w:rPr>
+          <w:rFonts w:ascii="Times New Roman" w:hAnsi="Times New Roman"/>
+          <w:b/>
+        </w:rPr>
+        <w:t>Appendix C: Extended Sensitivity and Stress-Testing Analyses</w:t>
+      </w:r>
+    </w:p>
+    <w:p>
+      <w:r>
+        <w:rPr>
+          <w:rFonts w:ascii="Times New Roman" w:hAnsi="Times New Roman"/>
+        </w:rPr>
+        <w:t>To rigorously evaluate the robust operational limits of our proposed decision support framework, we conducted extensive sensitivity analyses across two critical supply chain risk dimensions: (a) asymmetric penalty ratio escalation where the unit stockout cost to inventory holding cost ratio p / h ranges from 2 to 50, and (b) supplier lead-time stochasticity where lead-time standard deviation \sigma_L varies between 0.1 and 3.0 days.</w:t>
+      </w:r>
+    </w:p>
+    <w:p>
+      <w:r>
+        <w:rPr>
+          <w:rFonts w:ascii="Times New Roman" w:hAnsi="Times New Roman"/>
+        </w:rPr>
+        <w:t>As demonstrated in Figure S1, unconstrained statistical minimization policies (Policy B) suffer from catastrophic linear cost inflation under increasing penalty ratios due to their persistent negative bias (-18.37%), which triggers frequent stockout events. In contrast, our proposed Tri-Criterion Safeguard (Policy C) and Dynamic Eve's Law Buffer Control (Policy D) maintain flat, optimized cost curves across the entire penalty spectrum. Furthermore, evaluating lead-time standard deviation reveals that traditional buffer formulas assuming deterministic lead times create a buffer deficit exceeding 60% as \sigma_L grows, leaving enterprise supply chains highly vulnerable to stockouts. Applying Eve's Law correctly accounts for compound variance \sigma_{LTD}^2 = L \sigma_D^2 + \mu_D^2 \sigma_L^2, preserving customer service levels.</w:t>
+      </w:r>
+    </w:p>
+    <w:p>
+      <w:r>
+        <w:drawing>
+          <wp:inline xmlns:a="http://schemas.openxmlformats.org/drawingml/2006/main" xmlns:pic="http://schemas.openxmlformats.org/drawingml/2006/picture">
+            <wp:extent cx="5669280" cy="1998523"/>
+            <wp:docPr id="1" name="Picture 1"/>
+            <wp:cNvGraphicFramePr>
+              <a:graphicFrameLocks noChangeAspect="1"/>
+            </wp:cNvGraphicFramePr>
+            <a:graphic>
+              <a:graphicData uri="http://schemas.openxmlformats.org/drawingml/2006/picture">
+                <pic:pic>
+                  <pic:nvPicPr>
+                    <pic:cNvPr id="0" name="fig10_sensitivity_analysis.png"/>
+                    <pic:cNvPicPr/>
+                  </pic:nvPicPr>
+                  <pic:blipFill>
+                    <a:blip r:embed="rId9"/>
+                    <a:stretch>
+                      <a:fillRect/>
+                    </a:stretch>
+                  </pic:blipFill>
+                  <pic:spPr>
+                    <a:xfrm>
+                      <a:off x="0" y="0"/>
+                      <a:ext cx="5669280" cy="1998523"/>
+                    </a:xfrm>
+                    <a:prstGeom prst="rect"/>
+                  </pic:spPr>
+                </pic:pic>
+              </a:graphicData>
+            </a:graphic>
+          </wp:inline>
+        </w:drawing>
+      </w:r>
+    </w:p>
+    <w:p>
+      <w:r>
+        <w:rPr>
+          <w:rFonts w:ascii="Times New Roman" w:hAnsi="Times New Roman"/>
+          <w:i/>
+        </w:rPr>
+        <w:t>Figure S1. (a) Replenishment policy operating costs across escalating penalty ratios (p / h); (b) Required buffer quantity and stockout vulnerability under increasing lead-time standard deviation \sigma_L.</w:t>
+      </w:r>
+    </w:p>
     <w:sectPr>
       <w:pgSz w:w="12240" w:h="15840"/>
       <w:pgMar w:top="1080" w:right="1080" w:bottom="1080" w:left="1080" w:header="720" w:footer="720" w:gutter="0"/>

</xml_diff>